<commit_message>
Marilyn Monroe: revisão crítica da Parte 4
Co-Authored-By: Claude Opus 5.5 <noreply@anthropic.com>
Claude-Session: https://claude.ai/code/session_01MJjUEEZrxQDEUifKK2vj9g
</commit_message>
<xml_diff>
--- a/roteiros/marilyn-monroe/MarilynMonroe_Parte4.docx
+++ b/roteiros/marilyn-monroe/MarilynMonroe_Parte4.docx
@@ -39,7 +39,7 @@
         <w:rPr>
           <w:color w:val="000000"/>
         </w:rPr>
-        <w:t>No fim daquele ano, Marilyn decidiu voltar para Los Angeles.</w:t>
+        <w:t>Na segunda metade daquele ano, Marilyn decidiu voltar para Los Angeles.</w:t>
       </w:r>
     </w:p>
     <w:p>
@@ -183,14 +183,6 @@
         <w:rPr>
           <w:color w:val="000000"/>
         </w:rPr>
-        <w:t>A plateia ficou em silêncio.</w:t>
-      </w:r>
-    </w:p>
-    <w:p>
-      <w:r>
-        <w:rPr>
-          <w:color w:val="000000"/>
-        </w:rPr>
         <w:t>Com a voz baixa e sussurrada, ela cantou "Happy Birthday, Mr. President".</w:t>
       </w:r>
     </w:p>
@@ -239,7 +231,7 @@
         <w:rPr>
           <w:color w:val="000000"/>
         </w:rPr>
-        <w:t>A Fox atravessava a pior fase da própria história. O estúdio estava afundado nos gastos de "Cleópatra", com Elizabeth Taylor, um dos filmes mais caros já feitos.</w:t>
+        <w:t>A Fox atravessava uma das piores fases da própria história. O estúdio estava afundado nos gastos de "Cleópatra", com Elizabeth Taylor, um dos filmes mais caros já feitos.</w:t>
       </w:r>
     </w:p>
     <w:p>
@@ -319,7 +311,7 @@
         <w:rPr>
           <w:color w:val="000000"/>
         </w:rPr>
-        <w:t>A produção parou. Mesmo assim, o estúdio abriu um processo contra ela, pedindo centenas de milhares de dólares de indenização. Nos jornais, executivos culpavam a atriz pelo prejuízo. Ela virou a estrela problemática, que atrasava e dava prejuízo.</w:t>
+        <w:t>A produção parou. Mesmo assim, o estúdio abriu um processo contra ela, pedindo centenas de milhares de dólares de indenização. Nos jornais, executivos do estúdio culparam a atriz pelo prejuízo. Marilyn virou a estrela problemática, que atrasava e faltava.</w:t>
       </w:r>
     </w:p>
     <w:p>
@@ -415,7 +407,7 @@
         <w:rPr>
           <w:color w:val="000000"/>
         </w:rPr>
-        <w:t>O que se sabe com certeza é que, naqueles meses, o telefone era a principal ponte de Marilyn com o mundo lá fora. Ela passava horas ligando para amigos e médicos, muitas vezes de madrugada.</w:t>
+        <w:t>O que se sabe com certeza é que, naqueles meses, o telefone era a principal ponte de Marilyn com o mundo lá fora. Ela passava horas ligando para amigos e médicos.</w:t>
       </w:r>
     </w:p>
     <w:p>
@@ -463,7 +455,7 @@
         <w:rPr>
           <w:color w:val="000000"/>
         </w:rPr>
-        <w:t>No fim de julho, a situação parecia melhorar. A Fox começou a negociar a volta dela ao filme. A Life publicou a entrevista. Amigos contaram que ela fazia planos.</w:t>
+        <w:t>Mesmo assim, naqueles dias, havia sinais de melhora. A Fox negociava a volta dela ao filme. No dia três de agosto, a Life publicou a entrevista. Amigos contaram que ela fazia planos.</w:t>
       </w:r>
     </w:p>
     <w:p>
@@ -472,22 +464,6 @@
           <w:color w:val="000000"/>
         </w:rPr>
         <w:t>Segundo alguns biógrafos, Joe DiMaggio também fazia planos. Tinha pedido demissão de um emprego para voltar à Califórnia. E pretendia pedir Marilyn em casamento de novo, naquele mesmo mês de agosto.</w:t>
-      </w:r>
-    </w:p>
-    <w:p>
-      <w:r>
-        <w:rPr>
-          <w:color w:val="000000"/>
-        </w:rPr>
-        <w:t>Então chegou o último dia.</w:t>
-      </w:r>
-    </w:p>
-    <w:p>
-      <w:r>
-        <w:rPr>
-          <w:color w:val="000000"/>
-        </w:rPr>
-        <w:t>Quatro de agosto de mil novecentos e sessenta e dois. Um sábado.</w:t>
       </w:r>
     </w:p>
     <w:p>
@@ -519,6 +495,22 @@
         <w:rPr>
           <w:color w:val="000000"/>
         </w:rPr>
+        <w:t>Então chegou o último dia.</w:t>
+      </w:r>
+    </w:p>
+    <w:p>
+      <w:r>
+        <w:rPr>
+          <w:color w:val="000000"/>
+        </w:rPr>
+        <w:t>Quatro de agosto de mil novecentos e sessenta e dois. Um sábado.</w:t>
+      </w:r>
+    </w:p>
+    <w:p>
+      <w:r>
+        <w:rPr>
+          <w:color w:val="000000"/>
+        </w:rPr>
         <w:t>À tarde, o doutor Greenson foi até a casa. Ficou lá por horas. Antes de ir embora, pediu a Eunice Murray que passasse a noite na casa.</w:t>
       </w:r>
     </w:p>
@@ -543,7 +535,7 @@
         <w:rPr>
           <w:color w:val="000000"/>
         </w:rPr>
-        <w:t>Segundo ele, Marilyn estava animada e parecia bem.</w:t>
+        <w:t>Segundo quem estava na casa, depois dessa ligação Marilyn parecia animada.</w:t>
       </w:r>
     </w:p>
     <w:p>

</xml_diff>